<commit_message>
Added Firebase opitons in Firebase doc
</commit_message>
<xml_diff>
--- a/flutter_more_documents/f40_firebase_flutter.docx
+++ b/flutter_more_documents/f40_firebase_flutter.docx
@@ -81,7 +81,23 @@
           <w:sz w:val="32"/>
           <w:szCs w:val="32"/>
         </w:rPr>
-        <w:t>Mandatory Things Before Connecting Firebase………….7</w:t>
+        <w:t xml:space="preserve">Mandatory Things Before Connecting </w:t>
+      </w:r>
+      <w:r>
+        <w:rPr>
+          <w:b/>
+          <w:bCs/>
+          <w:sz w:val="32"/>
+          <w:szCs w:val="32"/>
+        </w:rPr>
+        <w:t>Firebase</w:t>
+      </w:r>
+      <w:r>
+        <w:rPr>
+          <w:sz w:val="32"/>
+          <w:szCs w:val="32"/>
+        </w:rPr>
+        <w:t>………….7</w:t>
       </w:r>
     </w:p>
     <w:p>
@@ -304,6 +320,36 @@
           <w:szCs w:val="32"/>
         </w:rPr>
         <w:t>Security………………………………………………….38</w:t>
+      </w:r>
+    </w:p>
+    <w:p>
+      <w:pPr>
+        <w:pStyle w:val="ListParagraph"/>
+        <w:numPr>
+          <w:ilvl w:val="0"/>
+          <w:numId w:val="3"/>
+        </w:numPr>
+        <w:jc w:val="both"/>
+        <w:rPr>
+          <w:sz w:val="32"/>
+          <w:szCs w:val="32"/>
+        </w:rPr>
+      </w:pPr>
+      <w:r>
+        <w:rPr>
+          <w:b/>
+          <w:bCs/>
+          <w:sz w:val="32"/>
+          <w:szCs w:val="32"/>
+        </w:rPr>
+        <w:t>Firebase Options</w:t>
+      </w:r>
+      <w:r>
+        <w:rPr>
+          <w:sz w:val="32"/>
+          <w:szCs w:val="32"/>
+        </w:rPr>
+        <w:t>………………………………………………….</w:t>
       </w:r>
     </w:p>
     <w:p>
@@ -23007,6 +23053,1778 @@
         </w:rPr>
       </w:pPr>
     </w:p>
+    <w:p>
+      <w:pPr>
+        <w:jc w:val="center"/>
+        <w:rPr>
+          <w:sz w:val="32"/>
+          <w:szCs w:val="32"/>
+        </w:rPr>
+      </w:pPr>
+      <w:r>
+        <w:rPr>
+          <w:sz w:val="32"/>
+          <w:szCs w:val="32"/>
+        </w:rPr>
+        <w:t>Break</w:t>
+      </w:r>
+    </w:p>
+    <w:p>
+      <w:pPr>
+        <w:jc w:val="both"/>
+        <w:rPr>
+          <w:sz w:val="32"/>
+          <w:szCs w:val="32"/>
+        </w:rPr>
+      </w:pPr>
+    </w:p>
+    <w:p>
+      <w:pPr>
+        <w:jc w:val="both"/>
+        <w:rPr>
+          <w:b/>
+          <w:bCs/>
+          <w:sz w:val="32"/>
+          <w:szCs w:val="32"/>
+        </w:rPr>
+      </w:pPr>
+      <w:r>
+        <w:rPr>
+          <w:b/>
+          <w:bCs/>
+          <w:sz w:val="32"/>
+          <w:szCs w:val="32"/>
+        </w:rPr>
+        <w:t xml:space="preserve">Firebase </w:t>
+      </w:r>
+      <w:r>
+        <w:rPr>
+          <w:b/>
+          <w:bCs/>
+          <w:sz w:val="32"/>
+          <w:szCs w:val="32"/>
+        </w:rPr>
+        <w:t>Options</w:t>
+      </w:r>
+      <w:r>
+        <w:rPr>
+          <w:b/>
+          <w:bCs/>
+          <w:sz w:val="32"/>
+          <w:szCs w:val="32"/>
+        </w:rPr>
+        <w:t>:</w:t>
+      </w:r>
+    </w:p>
+    <w:p>
+      <w:pPr>
+        <w:jc w:val="both"/>
+        <w:rPr>
+          <w:sz w:val="32"/>
+          <w:szCs w:val="32"/>
+        </w:rPr>
+      </w:pPr>
+      <w:r>
+        <w:rPr>
+          <w:sz w:val="32"/>
+          <w:szCs w:val="32"/>
+        </w:rPr>
+        <w:t xml:space="preserve"># </w:t>
+      </w:r>
+      <w:proofErr w:type="spellStart"/>
+      <w:r>
+        <w:rPr>
+          <w:b/>
+          <w:bCs/>
+          <w:sz w:val="32"/>
+          <w:szCs w:val="32"/>
+        </w:rPr>
+        <w:t>FirebaseOptions</w:t>
+      </w:r>
+      <w:proofErr w:type="spellEnd"/>
+      <w:r>
+        <w:rPr>
+          <w:sz w:val="32"/>
+          <w:szCs w:val="32"/>
+        </w:rPr>
+        <w:t xml:space="preserve"> exists </w:t>
+      </w:r>
+      <w:r>
+        <w:rPr>
+          <w:sz w:val="32"/>
+          <w:szCs w:val="32"/>
+        </w:rPr>
+        <w:t>because t</w:t>
+      </w:r>
+      <w:r>
+        <w:rPr>
+          <w:sz w:val="32"/>
+          <w:szCs w:val="32"/>
+        </w:rPr>
+        <w:t xml:space="preserve">he native approach </w:t>
+      </w:r>
+      <w:r>
+        <w:rPr>
+          <w:sz w:val="32"/>
+          <w:szCs w:val="32"/>
+        </w:rPr>
+        <w:t xml:space="preserve">like </w:t>
+      </w:r>
+      <w:r>
+        <w:rPr>
+          <w:b/>
+          <w:bCs/>
+          <w:sz w:val="32"/>
+          <w:szCs w:val="32"/>
+        </w:rPr>
+        <w:t>google-</w:t>
+      </w:r>
+      <w:proofErr w:type="spellStart"/>
+      <w:r>
+        <w:rPr>
+          <w:b/>
+          <w:bCs/>
+          <w:sz w:val="32"/>
+          <w:szCs w:val="32"/>
+        </w:rPr>
+        <w:t>services.json</w:t>
+      </w:r>
+      <w:proofErr w:type="spellEnd"/>
+      <w:r>
+        <w:rPr>
+          <w:sz w:val="32"/>
+          <w:szCs w:val="32"/>
+        </w:rPr>
+        <w:t xml:space="preserve"> file</w:t>
+      </w:r>
+      <w:r>
+        <w:rPr>
+          <w:sz w:val="32"/>
+          <w:szCs w:val="32"/>
+        </w:rPr>
+        <w:t xml:space="preserve"> only works because Android and iOS both have a native plugin/script that reads a file on disk before our </w:t>
+      </w:r>
+      <w:r>
+        <w:rPr>
+          <w:b/>
+          <w:bCs/>
+          <w:sz w:val="32"/>
+          <w:szCs w:val="32"/>
+        </w:rPr>
+        <w:t xml:space="preserve">Dart </w:t>
+      </w:r>
+      <w:r>
+        <w:rPr>
+          <w:sz w:val="32"/>
+          <w:szCs w:val="32"/>
+        </w:rPr>
+        <w:t>code runs.</w:t>
+      </w:r>
+    </w:p>
+    <w:p>
+      <w:pPr>
+        <w:jc w:val="both"/>
+        <w:rPr>
+          <w:sz w:val="32"/>
+          <w:szCs w:val="32"/>
+        </w:rPr>
+      </w:pPr>
+      <w:r>
+        <w:rPr>
+          <w:sz w:val="32"/>
+          <w:szCs w:val="32"/>
+        </w:rPr>
+        <w:t>#</w:t>
+      </w:r>
+      <w:r>
+        <w:rPr>
+          <w:b/>
+          <w:bCs/>
+          <w:sz w:val="32"/>
+          <w:szCs w:val="32"/>
+        </w:rPr>
+        <w:t xml:space="preserve"> </w:t>
+      </w:r>
+      <w:proofErr w:type="spellStart"/>
+      <w:r>
+        <w:rPr>
+          <w:b/>
+          <w:bCs/>
+          <w:sz w:val="32"/>
+          <w:szCs w:val="32"/>
+        </w:rPr>
+        <w:t>FirebaseOptions</w:t>
+      </w:r>
+      <w:proofErr w:type="spellEnd"/>
+      <w:r>
+        <w:rPr>
+          <w:sz w:val="32"/>
+          <w:szCs w:val="32"/>
+        </w:rPr>
+        <w:t xml:space="preserve"> exists for the platforms that don't have that namely Flutter Web and Desktop (Windows/Linux/macOS) where there's no</w:t>
+      </w:r>
+      <w:r>
+        <w:rPr>
+          <w:b/>
+          <w:bCs/>
+          <w:sz w:val="32"/>
+          <w:szCs w:val="32"/>
+        </w:rPr>
+        <w:t xml:space="preserve"> google-</w:t>
+      </w:r>
+      <w:proofErr w:type="spellStart"/>
+      <w:proofErr w:type="gramStart"/>
+      <w:r>
+        <w:rPr>
+          <w:b/>
+          <w:bCs/>
+          <w:sz w:val="32"/>
+          <w:szCs w:val="32"/>
+        </w:rPr>
+        <w:t>services.json</w:t>
+      </w:r>
+      <w:proofErr w:type="spellEnd"/>
+      <w:proofErr w:type="gramEnd"/>
+      <w:r>
+        <w:rPr>
+          <w:sz w:val="32"/>
+          <w:szCs w:val="32"/>
+        </w:rPr>
+        <w:t>-equivalent native auto-loader.</w:t>
+      </w:r>
+    </w:p>
+    <w:p>
+      <w:pPr>
+        <w:jc w:val="both"/>
+        <w:rPr>
+          <w:sz w:val="32"/>
+          <w:szCs w:val="32"/>
+        </w:rPr>
+      </w:pPr>
+      <w:r>
+        <w:rPr>
+          <w:sz w:val="32"/>
+          <w:szCs w:val="32"/>
+        </w:rPr>
+        <w:t xml:space="preserve"># </w:t>
+      </w:r>
+      <w:r>
+        <w:rPr>
+          <w:sz w:val="32"/>
+          <w:szCs w:val="32"/>
+        </w:rPr>
+        <w:t xml:space="preserve">On those platforms, </w:t>
+      </w:r>
+      <w:r>
+        <w:rPr>
+          <w:sz w:val="32"/>
+          <w:szCs w:val="32"/>
+        </w:rPr>
+        <w:t>we</w:t>
+      </w:r>
+      <w:r>
+        <w:rPr>
+          <w:sz w:val="32"/>
+          <w:szCs w:val="32"/>
+        </w:rPr>
+        <w:t xml:space="preserve"> have no choice </w:t>
+      </w:r>
+      <w:r>
+        <w:rPr>
+          <w:sz w:val="32"/>
+          <w:szCs w:val="32"/>
+        </w:rPr>
+        <w:t>but</w:t>
+      </w:r>
+      <w:r>
+        <w:rPr>
+          <w:sz w:val="32"/>
+          <w:szCs w:val="32"/>
+        </w:rPr>
+        <w:t xml:space="preserve"> must pass </w:t>
+      </w:r>
+      <w:proofErr w:type="spellStart"/>
+      <w:r>
+        <w:rPr>
+          <w:b/>
+          <w:bCs/>
+          <w:sz w:val="32"/>
+          <w:szCs w:val="32"/>
+        </w:rPr>
+        <w:t>FirebaseOptions</w:t>
+      </w:r>
+      <w:proofErr w:type="spellEnd"/>
+      <w:r>
+        <w:rPr>
+          <w:sz w:val="32"/>
+          <w:szCs w:val="32"/>
+        </w:rPr>
+        <w:t xml:space="preserve"> explicitly in </w:t>
+      </w:r>
+      <w:r>
+        <w:rPr>
+          <w:b/>
+          <w:bCs/>
+          <w:sz w:val="32"/>
+          <w:szCs w:val="32"/>
+        </w:rPr>
+        <w:t>Dart</w:t>
+      </w:r>
+      <w:r>
+        <w:rPr>
+          <w:b/>
+          <w:bCs/>
+          <w:sz w:val="32"/>
+          <w:szCs w:val="32"/>
+        </w:rPr>
+        <w:t xml:space="preserve"> </w:t>
+      </w:r>
+      <w:r>
+        <w:rPr>
+          <w:sz w:val="32"/>
+          <w:szCs w:val="32"/>
+        </w:rPr>
+        <w:t xml:space="preserve">code (in </w:t>
+      </w:r>
+      <w:proofErr w:type="gramStart"/>
+      <w:r>
+        <w:rPr>
+          <w:b/>
+          <w:bCs/>
+          <w:sz w:val="32"/>
+          <w:szCs w:val="32"/>
+        </w:rPr>
+        <w:t>main(</w:t>
+      </w:r>
+      <w:proofErr w:type="gramEnd"/>
+      <w:r>
+        <w:rPr>
+          <w:b/>
+          <w:bCs/>
+          <w:sz w:val="32"/>
+          <w:szCs w:val="32"/>
+        </w:rPr>
+        <w:t>)</w:t>
+      </w:r>
+      <w:r>
+        <w:rPr>
+          <w:sz w:val="32"/>
+          <w:szCs w:val="32"/>
+        </w:rPr>
+        <w:t>)</w:t>
+      </w:r>
+      <w:r>
+        <w:rPr>
+          <w:sz w:val="32"/>
+          <w:szCs w:val="32"/>
+        </w:rPr>
+        <w:t>, because there's nothing else to read it from.</w:t>
+      </w:r>
+    </w:p>
+    <w:p>
+      <w:pPr>
+        <w:jc w:val="both"/>
+        <w:rPr>
+          <w:sz w:val="32"/>
+          <w:szCs w:val="32"/>
+        </w:rPr>
+      </w:pPr>
+      <w:r>
+        <w:rPr>
+          <w:sz w:val="32"/>
+          <w:szCs w:val="32"/>
+        </w:rPr>
+        <w:t xml:space="preserve"># </w:t>
+      </w:r>
+      <w:r>
+        <w:rPr>
+          <w:sz w:val="32"/>
+          <w:szCs w:val="32"/>
+        </w:rPr>
+        <w:t xml:space="preserve">That's why </w:t>
+      </w:r>
+      <w:proofErr w:type="spellStart"/>
+      <w:r>
+        <w:rPr>
+          <w:b/>
+          <w:bCs/>
+          <w:sz w:val="32"/>
+          <w:szCs w:val="32"/>
+        </w:rPr>
+        <w:t>flutterfire</w:t>
+      </w:r>
+      <w:proofErr w:type="spellEnd"/>
+      <w:r>
+        <w:rPr>
+          <w:sz w:val="32"/>
+          <w:szCs w:val="32"/>
+        </w:rPr>
+        <w:t xml:space="preserve"> </w:t>
+      </w:r>
+      <w:r>
+        <w:rPr>
+          <w:b/>
+          <w:bCs/>
+          <w:sz w:val="32"/>
+          <w:szCs w:val="32"/>
+        </w:rPr>
+        <w:t>configure</w:t>
+      </w:r>
+      <w:r>
+        <w:rPr>
+          <w:sz w:val="32"/>
+          <w:szCs w:val="32"/>
+        </w:rPr>
+        <w:t xml:space="preserve"> CLI</w:t>
+      </w:r>
+      <w:r>
+        <w:rPr>
+          <w:sz w:val="32"/>
+          <w:szCs w:val="32"/>
+        </w:rPr>
+        <w:t xml:space="preserve"> also generates a </w:t>
+      </w:r>
+      <w:proofErr w:type="spellStart"/>
+      <w:r>
+        <w:rPr>
+          <w:sz w:val="32"/>
+          <w:szCs w:val="32"/>
+        </w:rPr>
+        <w:t>f</w:t>
+      </w:r>
+      <w:r>
+        <w:rPr>
+          <w:b/>
+          <w:bCs/>
+          <w:sz w:val="32"/>
+          <w:szCs w:val="32"/>
+        </w:rPr>
+        <w:t>irebase_options.dart</w:t>
+      </w:r>
+      <w:proofErr w:type="spellEnd"/>
+      <w:r>
+        <w:rPr>
+          <w:sz w:val="32"/>
+          <w:szCs w:val="32"/>
+        </w:rPr>
+        <w:t xml:space="preserve"> file alongside the native files</w:t>
+      </w:r>
+      <w:r>
+        <w:rPr>
+          <w:sz w:val="32"/>
+          <w:szCs w:val="32"/>
+        </w:rPr>
+        <w:t>.</w:t>
+      </w:r>
+      <w:r>
+        <w:rPr>
+          <w:sz w:val="32"/>
+          <w:szCs w:val="32"/>
+        </w:rPr>
+        <w:t xml:space="preserve"> </w:t>
+      </w:r>
+      <w:r>
+        <w:rPr>
+          <w:sz w:val="32"/>
+          <w:szCs w:val="32"/>
+        </w:rPr>
+        <w:t>I</w:t>
+      </w:r>
+      <w:r>
+        <w:rPr>
+          <w:sz w:val="32"/>
+          <w:szCs w:val="32"/>
+        </w:rPr>
+        <w:t xml:space="preserve">t's there specifically for web/desktop targets. For an Android/iOS-only app </w:t>
+      </w:r>
+      <w:r>
+        <w:rPr>
+          <w:sz w:val="32"/>
+          <w:szCs w:val="32"/>
+        </w:rPr>
+        <w:t xml:space="preserve">we </w:t>
+      </w:r>
+      <w:r>
+        <w:rPr>
+          <w:sz w:val="32"/>
+          <w:szCs w:val="32"/>
+        </w:rPr>
+        <w:t>can safely ignore that generated file and rely purely on</w:t>
+      </w:r>
+      <w:r>
+        <w:rPr>
+          <w:sz w:val="32"/>
+          <w:szCs w:val="32"/>
+        </w:rPr>
+        <w:t xml:space="preserve"> </w:t>
+      </w:r>
+      <w:proofErr w:type="spellStart"/>
+      <w:r>
+        <w:rPr>
+          <w:b/>
+          <w:bCs/>
+          <w:sz w:val="32"/>
+          <w:szCs w:val="32"/>
+        </w:rPr>
+        <w:t>Firebase.initializeApp</w:t>
+      </w:r>
+      <w:proofErr w:type="spellEnd"/>
+      <w:r>
+        <w:rPr>
+          <w:b/>
+          <w:bCs/>
+          <w:sz w:val="32"/>
+          <w:szCs w:val="32"/>
+        </w:rPr>
+        <w:t>()</w:t>
+      </w:r>
+      <w:r>
+        <w:rPr>
+          <w:sz w:val="32"/>
+          <w:szCs w:val="32"/>
+        </w:rPr>
+        <w:t xml:space="preserve"> without </w:t>
+      </w:r>
+      <w:proofErr w:type="spellStart"/>
+      <w:r>
+        <w:rPr>
+          <w:b/>
+          <w:bCs/>
+          <w:sz w:val="32"/>
+          <w:szCs w:val="32"/>
+        </w:rPr>
+        <w:t>opitons</w:t>
+      </w:r>
+      <w:proofErr w:type="spellEnd"/>
+      <w:r>
+        <w:rPr>
+          <w:b/>
+          <w:bCs/>
+          <w:sz w:val="32"/>
+          <w:szCs w:val="32"/>
+        </w:rPr>
+        <w:t>:</w:t>
+      </w:r>
+    </w:p>
+    <w:p>
+      <w:pPr>
+        <w:jc w:val="both"/>
+        <w:rPr>
+          <w:sz w:val="32"/>
+          <w:szCs w:val="32"/>
+        </w:rPr>
+      </w:pPr>
+    </w:p>
+    <w:p>
+      <w:pPr>
+        <w:jc w:val="both"/>
+        <w:rPr>
+          <w:sz w:val="32"/>
+          <w:szCs w:val="32"/>
+        </w:rPr>
+      </w:pPr>
+    </w:p>
+    <w:p>
+      <w:pPr>
+        <w:jc w:val="both"/>
+        <w:rPr>
+          <w:sz w:val="32"/>
+          <w:szCs w:val="32"/>
+        </w:rPr>
+      </w:pPr>
+      <w:r>
+        <w:rPr>
+          <w:sz w:val="32"/>
+          <w:szCs w:val="32"/>
+        </w:rPr>
+        <w:lastRenderedPageBreak/>
+        <w:t>Basic Usage:</w:t>
+      </w:r>
+    </w:p>
+    <w:p>
+      <w:pPr>
+        <w:jc w:val="both"/>
+        <w:rPr>
+          <w:sz w:val="32"/>
+          <w:szCs w:val="32"/>
+        </w:rPr>
+      </w:pPr>
+      <w:r>
+        <w:rPr>
+          <w:sz w:val="32"/>
+          <w:szCs w:val="32"/>
+        </w:rPr>
+        <w:t xml:space="preserve"># When we initialize </w:t>
+      </w:r>
+      <w:r>
+        <w:rPr>
+          <w:b/>
+          <w:bCs/>
+          <w:sz w:val="32"/>
+          <w:szCs w:val="32"/>
+        </w:rPr>
+        <w:t>Firebase</w:t>
+      </w:r>
+      <w:r>
+        <w:rPr>
+          <w:sz w:val="32"/>
+          <w:szCs w:val="32"/>
+        </w:rPr>
+        <w:t xml:space="preserve"> in </w:t>
+      </w:r>
+      <w:proofErr w:type="gramStart"/>
+      <w:r>
+        <w:rPr>
+          <w:b/>
+          <w:bCs/>
+          <w:sz w:val="32"/>
+          <w:szCs w:val="32"/>
+        </w:rPr>
+        <w:t>main</w:t>
+      </w:r>
+      <w:r>
+        <w:rPr>
+          <w:b/>
+          <w:bCs/>
+          <w:sz w:val="32"/>
+          <w:szCs w:val="32"/>
+        </w:rPr>
+        <w:t>(</w:t>
+      </w:r>
+      <w:proofErr w:type="gramEnd"/>
+      <w:r>
+        <w:rPr>
+          <w:b/>
+          <w:bCs/>
+          <w:sz w:val="32"/>
+          <w:szCs w:val="32"/>
+        </w:rPr>
+        <w:t xml:space="preserve">) </w:t>
+      </w:r>
+      <w:r>
+        <w:rPr>
+          <w:sz w:val="32"/>
+          <w:szCs w:val="32"/>
+        </w:rPr>
+        <w:t xml:space="preserve">method  using </w:t>
+      </w:r>
+      <w:proofErr w:type="spellStart"/>
+      <w:r>
+        <w:rPr>
+          <w:b/>
+          <w:bCs/>
+          <w:sz w:val="32"/>
+          <w:szCs w:val="32"/>
+        </w:rPr>
+        <w:t>Firebase.initializeApp</w:t>
+      </w:r>
+      <w:proofErr w:type="spellEnd"/>
+      <w:r>
+        <w:rPr>
+          <w:b/>
+          <w:bCs/>
+          <w:sz w:val="32"/>
+          <w:szCs w:val="32"/>
+        </w:rPr>
+        <w:t>(</w:t>
+      </w:r>
+      <w:r>
+        <w:rPr>
+          <w:sz w:val="32"/>
+          <w:szCs w:val="32"/>
+        </w:rPr>
+        <w:t xml:space="preserve">) method. This method has an </w:t>
+      </w:r>
+      <w:r>
+        <w:rPr>
+          <w:b/>
+          <w:bCs/>
+          <w:sz w:val="32"/>
+          <w:szCs w:val="32"/>
+        </w:rPr>
+        <w:t xml:space="preserve">options: </w:t>
+      </w:r>
+      <w:r>
+        <w:rPr>
+          <w:sz w:val="32"/>
+          <w:szCs w:val="32"/>
+        </w:rPr>
+        <w:t xml:space="preserve">property which takes an instance or Object of </w:t>
+      </w:r>
+      <w:proofErr w:type="spellStart"/>
+      <w:proofErr w:type="gramStart"/>
+      <w:r>
+        <w:rPr>
+          <w:b/>
+          <w:bCs/>
+          <w:sz w:val="32"/>
+          <w:szCs w:val="32"/>
+        </w:rPr>
+        <w:t>FirebaseOptions</w:t>
+      </w:r>
+      <w:proofErr w:type="spellEnd"/>
+      <w:r>
+        <w:rPr>
+          <w:b/>
+          <w:bCs/>
+          <w:sz w:val="32"/>
+          <w:szCs w:val="32"/>
+        </w:rPr>
+        <w:t>(</w:t>
+      </w:r>
+      <w:proofErr w:type="gramEnd"/>
+      <w:r>
+        <w:rPr>
+          <w:b/>
+          <w:bCs/>
+          <w:sz w:val="32"/>
+          <w:szCs w:val="32"/>
+        </w:rPr>
+        <w:t>)</w:t>
+      </w:r>
+      <w:r>
+        <w:rPr>
+          <w:sz w:val="32"/>
+          <w:szCs w:val="32"/>
+        </w:rPr>
+        <w:t xml:space="preserve"> class</w:t>
+      </w:r>
+    </w:p>
+    <w:p>
+      <w:pPr>
+        <w:jc w:val="both"/>
+        <w:rPr>
+          <w:sz w:val="32"/>
+          <w:szCs w:val="32"/>
+        </w:rPr>
+      </w:pPr>
+      <w:r>
+        <w:rPr>
+          <w:sz w:val="32"/>
+          <w:szCs w:val="32"/>
+        </w:rPr>
+        <w:t xml:space="preserve"># If we specify </w:t>
+      </w:r>
+      <w:proofErr w:type="spellStart"/>
+      <w:proofErr w:type="gramStart"/>
+      <w:r>
+        <w:rPr>
+          <w:b/>
+          <w:bCs/>
+          <w:sz w:val="32"/>
+          <w:szCs w:val="32"/>
+        </w:rPr>
+        <w:t>FirebaseOptions</w:t>
+      </w:r>
+      <w:proofErr w:type="spellEnd"/>
+      <w:r>
+        <w:rPr>
+          <w:b/>
+          <w:bCs/>
+          <w:sz w:val="32"/>
+          <w:szCs w:val="32"/>
+        </w:rPr>
+        <w:t>(</w:t>
+      </w:r>
+      <w:proofErr w:type="gramEnd"/>
+      <w:r>
+        <w:rPr>
+          <w:b/>
+          <w:bCs/>
+          <w:sz w:val="32"/>
+          <w:szCs w:val="32"/>
+        </w:rPr>
+        <w:t>)</w:t>
+      </w:r>
+      <w:r>
+        <w:rPr>
+          <w:sz w:val="32"/>
+          <w:szCs w:val="32"/>
+        </w:rPr>
+        <w:t xml:space="preserve"> in </w:t>
+      </w:r>
+      <w:r>
+        <w:rPr>
+          <w:b/>
+          <w:bCs/>
+          <w:sz w:val="32"/>
+          <w:szCs w:val="32"/>
+        </w:rPr>
+        <w:t>options:</w:t>
+      </w:r>
+      <w:r>
+        <w:rPr>
+          <w:sz w:val="32"/>
+          <w:szCs w:val="32"/>
+        </w:rPr>
+        <w:t xml:space="preserve"> then </w:t>
+      </w:r>
+      <w:r>
+        <w:rPr>
+          <w:b/>
+          <w:bCs/>
+          <w:sz w:val="32"/>
+          <w:szCs w:val="32"/>
+        </w:rPr>
+        <w:t>google-</w:t>
+      </w:r>
+      <w:proofErr w:type="spellStart"/>
+      <w:r>
+        <w:rPr>
+          <w:b/>
+          <w:bCs/>
+          <w:sz w:val="32"/>
+          <w:szCs w:val="32"/>
+        </w:rPr>
+        <w:t>services.json</w:t>
+      </w:r>
+      <w:proofErr w:type="spellEnd"/>
+      <w:r>
+        <w:rPr>
+          <w:sz w:val="32"/>
+          <w:szCs w:val="32"/>
+        </w:rPr>
+        <w:t xml:space="preserve"> is not </w:t>
+      </w:r>
+      <w:r>
+        <w:rPr>
+          <w:sz w:val="32"/>
+          <w:szCs w:val="32"/>
+        </w:rPr>
+        <w:t>used</w:t>
+      </w:r>
+      <w:r>
+        <w:rPr>
+          <w:sz w:val="32"/>
+          <w:szCs w:val="32"/>
+        </w:rPr>
+        <w:t>.</w:t>
+      </w:r>
+    </w:p>
+    <w:p>
+      <w:pPr>
+        <w:jc w:val="both"/>
+        <w:rPr>
+          <w:sz w:val="32"/>
+          <w:szCs w:val="32"/>
+        </w:rPr>
+      </w:pPr>
+      <w:r>
+        <w:rPr>
+          <w:sz w:val="32"/>
+          <w:szCs w:val="32"/>
+        </w:rPr>
+        <w:t xml:space="preserve"># Here </w:t>
+      </w:r>
+      <w:proofErr w:type="spellStart"/>
+      <w:proofErr w:type="gramStart"/>
+      <w:r>
+        <w:rPr>
+          <w:b/>
+          <w:bCs/>
+          <w:sz w:val="32"/>
+          <w:szCs w:val="32"/>
+        </w:rPr>
+        <w:t>FirebaseOptions</w:t>
+      </w:r>
+      <w:proofErr w:type="spellEnd"/>
+      <w:r>
+        <w:rPr>
+          <w:b/>
+          <w:bCs/>
+          <w:sz w:val="32"/>
+          <w:szCs w:val="32"/>
+        </w:rPr>
+        <w:t>(</w:t>
+      </w:r>
+      <w:proofErr w:type="gramEnd"/>
+      <w:r>
+        <w:rPr>
+          <w:b/>
+          <w:bCs/>
+          <w:sz w:val="32"/>
+          <w:szCs w:val="32"/>
+        </w:rPr>
+        <w:t>)</w:t>
+      </w:r>
+      <w:r>
+        <w:rPr>
+          <w:sz w:val="32"/>
+          <w:szCs w:val="32"/>
+        </w:rPr>
+        <w:t xml:space="preserve"> has properties like:</w:t>
+      </w:r>
+    </w:p>
+    <w:p>
+      <w:pPr>
+        <w:pStyle w:val="ListParagraph"/>
+        <w:numPr>
+          <w:ilvl w:val="0"/>
+          <w:numId w:val="48"/>
+        </w:numPr>
+        <w:jc w:val="both"/>
+        <w:rPr>
+          <w:sz w:val="32"/>
+          <w:szCs w:val="32"/>
+        </w:rPr>
+      </w:pPr>
+      <w:proofErr w:type="spellStart"/>
+      <w:r>
+        <w:rPr>
+          <w:b/>
+          <w:bCs/>
+          <w:sz w:val="32"/>
+          <w:szCs w:val="32"/>
+        </w:rPr>
+        <w:t>apiKey</w:t>
+      </w:r>
+      <w:proofErr w:type="spellEnd"/>
+      <w:r>
+        <w:rPr>
+          <w:b/>
+          <w:bCs/>
+          <w:sz w:val="32"/>
+          <w:szCs w:val="32"/>
+        </w:rPr>
+        <w:t xml:space="preserve">: </w:t>
+      </w:r>
+      <w:r>
+        <w:rPr>
+          <w:sz w:val="32"/>
+          <w:szCs w:val="32"/>
+        </w:rPr>
+        <w:t xml:space="preserve">identifies our </w:t>
+      </w:r>
+      <w:r>
+        <w:rPr>
+          <w:b/>
+          <w:bCs/>
+          <w:sz w:val="32"/>
+          <w:szCs w:val="32"/>
+        </w:rPr>
+        <w:t>Firebase</w:t>
+      </w:r>
+      <w:r>
+        <w:rPr>
+          <w:sz w:val="32"/>
+          <w:szCs w:val="32"/>
+        </w:rPr>
+        <w:t xml:space="preserve"> project when our app talks to </w:t>
+      </w:r>
+      <w:r>
+        <w:rPr>
+          <w:b/>
+          <w:bCs/>
+          <w:sz w:val="32"/>
+          <w:szCs w:val="32"/>
+        </w:rPr>
+        <w:t xml:space="preserve">Firebase </w:t>
+      </w:r>
+      <w:r>
+        <w:rPr>
+          <w:sz w:val="32"/>
+          <w:szCs w:val="32"/>
+        </w:rPr>
+        <w:t>service. It’s not a secret by itself</w:t>
+      </w:r>
+    </w:p>
+    <w:p>
+      <w:pPr>
+        <w:pStyle w:val="ListParagraph"/>
+        <w:numPr>
+          <w:ilvl w:val="0"/>
+          <w:numId w:val="48"/>
+        </w:numPr>
+        <w:jc w:val="both"/>
+        <w:rPr>
+          <w:sz w:val="32"/>
+          <w:szCs w:val="32"/>
+        </w:rPr>
+      </w:pPr>
+      <w:proofErr w:type="spellStart"/>
+      <w:r>
+        <w:rPr>
+          <w:b/>
+          <w:bCs/>
+          <w:sz w:val="32"/>
+          <w:szCs w:val="32"/>
+        </w:rPr>
+        <w:t>appId</w:t>
+      </w:r>
+      <w:proofErr w:type="spellEnd"/>
+      <w:r>
+        <w:rPr>
+          <w:b/>
+          <w:bCs/>
+          <w:sz w:val="32"/>
+          <w:szCs w:val="32"/>
+        </w:rPr>
+        <w:t>:</w:t>
+      </w:r>
+      <w:r>
+        <w:rPr>
+          <w:sz w:val="32"/>
+          <w:szCs w:val="32"/>
+        </w:rPr>
+        <w:t xml:space="preserve"> The unique ID of our specific </w:t>
+      </w:r>
+      <w:r>
+        <w:rPr>
+          <w:b/>
+          <w:bCs/>
+          <w:sz w:val="32"/>
+          <w:szCs w:val="32"/>
+        </w:rPr>
+        <w:t>Firebase</w:t>
+      </w:r>
+      <w:r>
+        <w:rPr>
+          <w:sz w:val="32"/>
+          <w:szCs w:val="32"/>
+        </w:rPr>
+        <w:t xml:space="preserve"> app (Android, iOS or Web). It tells </w:t>
+      </w:r>
+      <w:r>
+        <w:rPr>
+          <w:b/>
+          <w:bCs/>
+          <w:sz w:val="32"/>
+          <w:szCs w:val="32"/>
+        </w:rPr>
+        <w:t>Firebase</w:t>
+      </w:r>
+      <w:r>
+        <w:rPr>
+          <w:sz w:val="32"/>
+          <w:szCs w:val="32"/>
+        </w:rPr>
+        <w:t xml:space="preserve"> exactly which app is connecting</w:t>
+      </w:r>
+    </w:p>
+    <w:p>
+      <w:pPr>
+        <w:pStyle w:val="ListParagraph"/>
+        <w:numPr>
+          <w:ilvl w:val="0"/>
+          <w:numId w:val="48"/>
+        </w:numPr>
+        <w:jc w:val="both"/>
+        <w:rPr>
+          <w:sz w:val="32"/>
+          <w:szCs w:val="32"/>
+        </w:rPr>
+      </w:pPr>
+      <w:proofErr w:type="spellStart"/>
+      <w:r>
+        <w:rPr>
+          <w:b/>
+          <w:bCs/>
+          <w:sz w:val="32"/>
+          <w:szCs w:val="32"/>
+        </w:rPr>
+        <w:t>projectId</w:t>
+      </w:r>
+      <w:proofErr w:type="spellEnd"/>
+      <w:r>
+        <w:rPr>
+          <w:b/>
+          <w:bCs/>
+          <w:sz w:val="32"/>
+          <w:szCs w:val="32"/>
+        </w:rPr>
+        <w:t>:</w:t>
+      </w:r>
+      <w:r>
+        <w:rPr>
+          <w:sz w:val="32"/>
+          <w:szCs w:val="32"/>
+        </w:rPr>
+        <w:t xml:space="preserve"> The unique identifier of our </w:t>
+      </w:r>
+      <w:r>
+        <w:rPr>
+          <w:b/>
+          <w:bCs/>
+          <w:sz w:val="32"/>
+          <w:szCs w:val="32"/>
+        </w:rPr>
+        <w:t>Firebase</w:t>
+      </w:r>
+      <w:r>
+        <w:rPr>
+          <w:sz w:val="32"/>
+          <w:szCs w:val="32"/>
+        </w:rPr>
+        <w:t xml:space="preserve"> project. All our </w:t>
+      </w:r>
+      <w:r>
+        <w:rPr>
+          <w:b/>
+          <w:bCs/>
+          <w:sz w:val="32"/>
+          <w:szCs w:val="32"/>
+        </w:rPr>
+        <w:t>Firebase</w:t>
+      </w:r>
+      <w:r>
+        <w:rPr>
+          <w:sz w:val="32"/>
+          <w:szCs w:val="32"/>
+        </w:rPr>
+        <w:t xml:space="preserve"> services (</w:t>
+      </w:r>
+      <w:proofErr w:type="spellStart"/>
+      <w:r>
+        <w:rPr>
+          <w:b/>
+          <w:bCs/>
+          <w:sz w:val="32"/>
+          <w:szCs w:val="32"/>
+        </w:rPr>
+        <w:t>Firestore</w:t>
+      </w:r>
+      <w:proofErr w:type="spellEnd"/>
+      <w:r>
+        <w:rPr>
+          <w:sz w:val="32"/>
+          <w:szCs w:val="32"/>
+        </w:rPr>
+        <w:t>, Auth, Storage etc.) belong to this project</w:t>
+      </w:r>
+    </w:p>
+    <w:p>
+      <w:pPr>
+        <w:pStyle w:val="ListParagraph"/>
+        <w:numPr>
+          <w:ilvl w:val="0"/>
+          <w:numId w:val="48"/>
+        </w:numPr>
+        <w:jc w:val="both"/>
+        <w:rPr>
+          <w:sz w:val="32"/>
+          <w:szCs w:val="32"/>
+        </w:rPr>
+      </w:pPr>
+      <w:proofErr w:type="spellStart"/>
+      <w:r>
+        <w:rPr>
+          <w:b/>
+          <w:bCs/>
+          <w:sz w:val="32"/>
+          <w:szCs w:val="32"/>
+        </w:rPr>
+        <w:t>messagingSenderId</w:t>
+      </w:r>
+      <w:proofErr w:type="spellEnd"/>
+      <w:r>
+        <w:rPr>
+          <w:b/>
+          <w:bCs/>
+          <w:sz w:val="32"/>
+          <w:szCs w:val="32"/>
+        </w:rPr>
+        <w:t>:</w:t>
+      </w:r>
+      <w:r>
+        <w:rPr>
+          <w:sz w:val="32"/>
+          <w:szCs w:val="32"/>
+        </w:rPr>
+        <w:t xml:space="preserve"> A unique numeric ID used by</w:t>
+      </w:r>
+      <w:r>
+        <w:rPr>
+          <w:b/>
+          <w:bCs/>
+          <w:sz w:val="32"/>
+          <w:szCs w:val="32"/>
+        </w:rPr>
+        <w:t xml:space="preserve"> Firebase Cloud Messaging</w:t>
+      </w:r>
+      <w:r>
+        <w:rPr>
+          <w:sz w:val="32"/>
+          <w:szCs w:val="32"/>
+        </w:rPr>
+        <w:t xml:space="preserve"> (</w:t>
+      </w:r>
+      <w:r>
+        <w:rPr>
+          <w:b/>
+          <w:bCs/>
+          <w:sz w:val="32"/>
+          <w:szCs w:val="32"/>
+        </w:rPr>
+        <w:t>FCM</w:t>
+      </w:r>
+      <w:r>
+        <w:rPr>
+          <w:sz w:val="32"/>
+          <w:szCs w:val="32"/>
+        </w:rPr>
+        <w:t>) to route push notifications to our app</w:t>
+      </w:r>
+    </w:p>
+    <w:p>
+      <w:pPr>
+        <w:jc w:val="both"/>
+        <w:rPr>
+          <w:b/>
+          <w:bCs/>
+          <w:color w:val="D86DCB" w:themeColor="accent5" w:themeTint="99"/>
+          <w:sz w:val="32"/>
+          <w:szCs w:val="32"/>
+        </w:rPr>
+      </w:pPr>
+      <w:r>
+        <w:rPr>
+          <w:b/>
+          <w:bCs/>
+          <w:color w:val="D86DCB" w:themeColor="accent5" w:themeTint="99"/>
+          <w:sz w:val="32"/>
+          <w:szCs w:val="32"/>
+        </w:rPr>
+        <w:t>void main () async {</w:t>
+      </w:r>
+    </w:p>
+    <w:p>
+      <w:pPr>
+        <w:jc w:val="both"/>
+        <w:rPr>
+          <w:b/>
+          <w:bCs/>
+          <w:color w:val="D86DCB" w:themeColor="accent5" w:themeTint="99"/>
+          <w:sz w:val="32"/>
+          <w:szCs w:val="32"/>
+        </w:rPr>
+      </w:pPr>
+      <w:r>
+        <w:rPr>
+          <w:b/>
+          <w:bCs/>
+          <w:color w:val="D86DCB" w:themeColor="accent5" w:themeTint="99"/>
+          <w:sz w:val="32"/>
+          <w:szCs w:val="32"/>
+        </w:rPr>
+        <w:t xml:space="preserve">   final </w:t>
+      </w:r>
+      <w:proofErr w:type="spellStart"/>
+      <w:r>
+        <w:rPr>
+          <w:b/>
+          <w:bCs/>
+          <w:color w:val="D86DCB" w:themeColor="accent5" w:themeTint="99"/>
+          <w:sz w:val="32"/>
+          <w:szCs w:val="32"/>
+        </w:rPr>
+        <w:t>firebaseOptions</w:t>
+      </w:r>
+      <w:proofErr w:type="spellEnd"/>
+      <w:r>
+        <w:rPr>
+          <w:b/>
+          <w:bCs/>
+          <w:color w:val="D86DCB" w:themeColor="accent5" w:themeTint="99"/>
+          <w:sz w:val="32"/>
+          <w:szCs w:val="32"/>
+        </w:rPr>
+        <w:t xml:space="preserve"> = </w:t>
+      </w:r>
+      <w:proofErr w:type="spellStart"/>
+      <w:proofErr w:type="gramStart"/>
+      <w:r>
+        <w:rPr>
+          <w:b/>
+          <w:bCs/>
+          <w:color w:val="D86DCB" w:themeColor="accent5" w:themeTint="99"/>
+          <w:sz w:val="32"/>
+          <w:szCs w:val="32"/>
+        </w:rPr>
+        <w:t>FirebaseOptions</w:t>
+      </w:r>
+      <w:proofErr w:type="spellEnd"/>
+      <w:r>
+        <w:rPr>
+          <w:b/>
+          <w:bCs/>
+          <w:color w:val="D86DCB" w:themeColor="accent5" w:themeTint="99"/>
+          <w:sz w:val="32"/>
+          <w:szCs w:val="32"/>
+        </w:rPr>
+        <w:t>(</w:t>
+      </w:r>
+      <w:proofErr w:type="gramEnd"/>
+    </w:p>
+    <w:p>
+      <w:pPr>
+        <w:jc w:val="both"/>
+        <w:rPr>
+          <w:b/>
+          <w:bCs/>
+          <w:color w:val="D86DCB" w:themeColor="accent5" w:themeTint="99"/>
+          <w:sz w:val="32"/>
+          <w:szCs w:val="32"/>
+        </w:rPr>
+      </w:pPr>
+      <w:r>
+        <w:rPr>
+          <w:b/>
+          <w:bCs/>
+          <w:color w:val="D86DCB" w:themeColor="accent5" w:themeTint="99"/>
+          <w:sz w:val="32"/>
+          <w:szCs w:val="32"/>
+        </w:rPr>
+        <w:t xml:space="preserve">   </w:t>
+      </w:r>
+      <w:r>
+        <w:rPr>
+          <w:b/>
+          <w:bCs/>
+          <w:color w:val="D86DCB" w:themeColor="accent5" w:themeTint="99"/>
+          <w:sz w:val="32"/>
+          <w:szCs w:val="32"/>
+        </w:rPr>
+        <w:t xml:space="preserve">      </w:t>
+      </w:r>
+      <w:proofErr w:type="spellStart"/>
+      <w:r>
+        <w:rPr>
+          <w:b/>
+          <w:bCs/>
+          <w:color w:val="D86DCB" w:themeColor="accent5" w:themeTint="99"/>
+          <w:sz w:val="32"/>
+          <w:szCs w:val="32"/>
+        </w:rPr>
+        <w:t>apiKey</w:t>
+      </w:r>
+      <w:proofErr w:type="spellEnd"/>
+      <w:r>
+        <w:rPr>
+          <w:b/>
+          <w:bCs/>
+          <w:color w:val="D86DCB" w:themeColor="accent5" w:themeTint="99"/>
+          <w:sz w:val="32"/>
+          <w:szCs w:val="32"/>
+        </w:rPr>
+        <w:t xml:space="preserve">: </w:t>
+      </w:r>
+      <w:r>
+        <w:rPr>
+          <w:b/>
+          <w:bCs/>
+          <w:color w:val="D86DCB" w:themeColor="accent5" w:themeTint="99"/>
+          <w:sz w:val="32"/>
+          <w:szCs w:val="32"/>
+        </w:rPr>
+        <w:t>'staging-</w:t>
+      </w:r>
+      <w:proofErr w:type="spellStart"/>
+      <w:r>
+        <w:rPr>
+          <w:b/>
+          <w:bCs/>
+          <w:color w:val="D86DCB" w:themeColor="accent5" w:themeTint="99"/>
+          <w:sz w:val="32"/>
+          <w:szCs w:val="32"/>
+        </w:rPr>
+        <w:t>api</w:t>
+      </w:r>
+      <w:proofErr w:type="spellEnd"/>
+      <w:r>
+        <w:rPr>
+          <w:b/>
+          <w:bCs/>
+          <w:color w:val="D86DCB" w:themeColor="accent5" w:themeTint="99"/>
+          <w:sz w:val="32"/>
+          <w:szCs w:val="32"/>
+        </w:rPr>
+        <w:t>-key',</w:t>
+      </w:r>
+    </w:p>
+    <w:p>
+      <w:pPr>
+        <w:jc w:val="both"/>
+        <w:rPr>
+          <w:b/>
+          <w:bCs/>
+          <w:color w:val="D86DCB" w:themeColor="accent5" w:themeTint="99"/>
+          <w:sz w:val="32"/>
+          <w:szCs w:val="32"/>
+        </w:rPr>
+      </w:pPr>
+      <w:r>
+        <w:rPr>
+          <w:b/>
+          <w:bCs/>
+          <w:color w:val="D86DCB" w:themeColor="accent5" w:themeTint="99"/>
+          <w:sz w:val="32"/>
+          <w:szCs w:val="32"/>
+        </w:rPr>
+        <w:t xml:space="preserve">         </w:t>
+      </w:r>
+      <w:proofErr w:type="spellStart"/>
+      <w:r>
+        <w:rPr>
+          <w:b/>
+          <w:bCs/>
+          <w:color w:val="D86DCB" w:themeColor="accent5" w:themeTint="99"/>
+          <w:sz w:val="32"/>
+          <w:szCs w:val="32"/>
+        </w:rPr>
+        <w:t>appId</w:t>
+      </w:r>
+      <w:proofErr w:type="spellEnd"/>
+      <w:r>
+        <w:rPr>
+          <w:b/>
+          <w:bCs/>
+          <w:color w:val="D86DCB" w:themeColor="accent5" w:themeTint="99"/>
+          <w:sz w:val="32"/>
+          <w:szCs w:val="32"/>
+        </w:rPr>
+        <w:t>: 'staging-app-id',</w:t>
+      </w:r>
+    </w:p>
+    <w:p>
+      <w:pPr>
+        <w:jc w:val="both"/>
+        <w:rPr>
+          <w:b/>
+          <w:bCs/>
+          <w:color w:val="D86DCB" w:themeColor="accent5" w:themeTint="99"/>
+          <w:sz w:val="32"/>
+          <w:szCs w:val="32"/>
+        </w:rPr>
+      </w:pPr>
+      <w:r>
+        <w:rPr>
+          <w:b/>
+          <w:bCs/>
+          <w:color w:val="D86DCB" w:themeColor="accent5" w:themeTint="99"/>
+          <w:sz w:val="32"/>
+          <w:szCs w:val="32"/>
+        </w:rPr>
+        <w:t xml:space="preserve">         </w:t>
+      </w:r>
+      <w:proofErr w:type="spellStart"/>
+      <w:r>
+        <w:rPr>
+          <w:b/>
+          <w:bCs/>
+          <w:color w:val="D86DCB" w:themeColor="accent5" w:themeTint="99"/>
+          <w:sz w:val="32"/>
+          <w:szCs w:val="32"/>
+        </w:rPr>
+        <w:t>projectId</w:t>
+      </w:r>
+      <w:proofErr w:type="spellEnd"/>
+      <w:r>
+        <w:rPr>
+          <w:b/>
+          <w:bCs/>
+          <w:color w:val="D86DCB" w:themeColor="accent5" w:themeTint="99"/>
+          <w:sz w:val="32"/>
+          <w:szCs w:val="32"/>
+        </w:rPr>
+        <w:t>: 'flavors-staging', // separate Firebase project</w:t>
+      </w:r>
+    </w:p>
+    <w:p>
+      <w:pPr>
+        <w:jc w:val="both"/>
+        <w:rPr>
+          <w:b/>
+          <w:bCs/>
+          <w:color w:val="D86DCB" w:themeColor="accent5" w:themeTint="99"/>
+          <w:sz w:val="32"/>
+          <w:szCs w:val="32"/>
+        </w:rPr>
+      </w:pPr>
+      <w:r>
+        <w:rPr>
+          <w:b/>
+          <w:bCs/>
+          <w:color w:val="D86DCB" w:themeColor="accent5" w:themeTint="99"/>
+          <w:sz w:val="32"/>
+          <w:szCs w:val="32"/>
+        </w:rPr>
+        <w:t xml:space="preserve">         </w:t>
+      </w:r>
+      <w:proofErr w:type="spellStart"/>
+      <w:r>
+        <w:rPr>
+          <w:b/>
+          <w:bCs/>
+          <w:color w:val="D86DCB" w:themeColor="accent5" w:themeTint="99"/>
+          <w:sz w:val="32"/>
+          <w:szCs w:val="32"/>
+        </w:rPr>
+        <w:t>messagingSenderId</w:t>
+      </w:r>
+      <w:proofErr w:type="spellEnd"/>
+      <w:r>
+        <w:rPr>
+          <w:b/>
+          <w:bCs/>
+          <w:color w:val="D86DCB" w:themeColor="accent5" w:themeTint="99"/>
+          <w:sz w:val="32"/>
+          <w:szCs w:val="32"/>
+        </w:rPr>
+        <w:t>: 'staging-sender-id',</w:t>
+      </w:r>
+    </w:p>
+    <w:p>
+      <w:pPr>
+        <w:jc w:val="both"/>
+        <w:rPr>
+          <w:b/>
+          <w:bCs/>
+          <w:color w:val="D86DCB" w:themeColor="accent5" w:themeTint="99"/>
+          <w:sz w:val="32"/>
+          <w:szCs w:val="32"/>
+        </w:rPr>
+      </w:pPr>
+      <w:r>
+        <w:rPr>
+          <w:b/>
+          <w:bCs/>
+          <w:color w:val="D86DCB" w:themeColor="accent5" w:themeTint="99"/>
+          <w:sz w:val="32"/>
+          <w:szCs w:val="32"/>
+        </w:rPr>
+        <w:t xml:space="preserve">   </w:t>
+      </w:r>
+      <w:r>
+        <w:rPr>
+          <w:b/>
+          <w:bCs/>
+          <w:color w:val="D86DCB" w:themeColor="accent5" w:themeTint="99"/>
+          <w:sz w:val="32"/>
+          <w:szCs w:val="32"/>
+        </w:rPr>
+        <w:t>);</w:t>
+      </w:r>
+    </w:p>
+    <w:p>
+      <w:pPr>
+        <w:jc w:val="both"/>
+        <w:rPr>
+          <w:b/>
+          <w:bCs/>
+          <w:color w:val="D86DCB" w:themeColor="accent5" w:themeTint="99"/>
+          <w:sz w:val="32"/>
+          <w:szCs w:val="32"/>
+        </w:rPr>
+      </w:pPr>
+      <w:r>
+        <w:rPr>
+          <w:b/>
+          <w:bCs/>
+          <w:color w:val="D86DCB" w:themeColor="accent5" w:themeTint="99"/>
+          <w:sz w:val="32"/>
+          <w:szCs w:val="32"/>
+        </w:rPr>
+        <w:t xml:space="preserve">   </w:t>
+      </w:r>
+      <w:r>
+        <w:rPr>
+          <w:b/>
+          <w:bCs/>
+          <w:color w:val="D86DCB" w:themeColor="accent5" w:themeTint="99"/>
+          <w:sz w:val="32"/>
+          <w:szCs w:val="32"/>
+        </w:rPr>
+        <w:t xml:space="preserve">await </w:t>
+      </w:r>
+      <w:proofErr w:type="spellStart"/>
+      <w:r>
+        <w:rPr>
+          <w:b/>
+          <w:bCs/>
+          <w:color w:val="D86DCB" w:themeColor="accent5" w:themeTint="99"/>
+          <w:sz w:val="32"/>
+          <w:szCs w:val="32"/>
+        </w:rPr>
+        <w:t>Firebase.initializeApp</w:t>
+      </w:r>
+      <w:proofErr w:type="spellEnd"/>
+      <w:r>
+        <w:rPr>
+          <w:b/>
+          <w:bCs/>
+          <w:color w:val="D86DCB" w:themeColor="accent5" w:themeTint="99"/>
+          <w:sz w:val="32"/>
+          <w:szCs w:val="32"/>
+        </w:rPr>
+        <w:t xml:space="preserve">(options: </w:t>
+      </w:r>
+      <w:proofErr w:type="spellStart"/>
+      <w:r>
+        <w:rPr>
+          <w:b/>
+          <w:bCs/>
+          <w:color w:val="D86DCB" w:themeColor="accent5" w:themeTint="99"/>
+          <w:sz w:val="32"/>
+          <w:szCs w:val="32"/>
+        </w:rPr>
+        <w:t>firebaseOptions</w:t>
+      </w:r>
+      <w:proofErr w:type="spellEnd"/>
+      <w:r>
+        <w:rPr>
+          <w:b/>
+          <w:bCs/>
+          <w:color w:val="D86DCB" w:themeColor="accent5" w:themeTint="99"/>
+          <w:sz w:val="32"/>
+          <w:szCs w:val="32"/>
+        </w:rPr>
+        <w:t>);</w:t>
+      </w:r>
+    </w:p>
+    <w:p>
+      <w:pPr>
+        <w:jc w:val="both"/>
+        <w:rPr>
+          <w:b/>
+          <w:bCs/>
+          <w:color w:val="D86DCB" w:themeColor="accent5" w:themeTint="99"/>
+          <w:sz w:val="32"/>
+          <w:szCs w:val="32"/>
+        </w:rPr>
+      </w:pPr>
+      <w:r>
+        <w:rPr>
+          <w:b/>
+          <w:bCs/>
+          <w:color w:val="D86DCB" w:themeColor="accent5" w:themeTint="99"/>
+          <w:sz w:val="32"/>
+          <w:szCs w:val="32"/>
+        </w:rPr>
+        <w:t xml:space="preserve">   </w:t>
+      </w:r>
+      <w:proofErr w:type="spellStart"/>
+      <w:proofErr w:type="gramStart"/>
+      <w:r>
+        <w:rPr>
+          <w:b/>
+          <w:bCs/>
+          <w:color w:val="D86DCB" w:themeColor="accent5" w:themeTint="99"/>
+          <w:sz w:val="32"/>
+          <w:szCs w:val="32"/>
+        </w:rPr>
+        <w:t>runApp</w:t>
+      </w:r>
+      <w:proofErr w:type="spellEnd"/>
+      <w:r>
+        <w:rPr>
+          <w:b/>
+          <w:bCs/>
+          <w:color w:val="D86DCB" w:themeColor="accent5" w:themeTint="99"/>
+          <w:sz w:val="32"/>
+          <w:szCs w:val="32"/>
+        </w:rPr>
+        <w:t>(</w:t>
+      </w:r>
+      <w:proofErr w:type="gramEnd"/>
+      <w:r>
+        <w:rPr>
+          <w:b/>
+          <w:bCs/>
+          <w:color w:val="D86DCB" w:themeColor="accent5" w:themeTint="99"/>
+          <w:sz w:val="32"/>
+          <w:szCs w:val="32"/>
+        </w:rPr>
+        <w:t xml:space="preserve">const </w:t>
+      </w:r>
+      <w:proofErr w:type="spellStart"/>
+      <w:r>
+        <w:rPr>
+          <w:b/>
+          <w:bCs/>
+          <w:color w:val="D86DCB" w:themeColor="accent5" w:themeTint="99"/>
+          <w:sz w:val="32"/>
+          <w:szCs w:val="32"/>
+        </w:rPr>
+        <w:t>MyApp</w:t>
+      </w:r>
+      <w:proofErr w:type="spellEnd"/>
+      <w:r>
+        <w:rPr>
+          <w:b/>
+          <w:bCs/>
+          <w:color w:val="D86DCB" w:themeColor="accent5" w:themeTint="99"/>
+          <w:sz w:val="32"/>
+          <w:szCs w:val="32"/>
+        </w:rPr>
+        <w:t>());</w:t>
+      </w:r>
+    </w:p>
+    <w:p>
+      <w:pPr>
+        <w:jc w:val="both"/>
+        <w:rPr>
+          <w:b/>
+          <w:bCs/>
+          <w:color w:val="D86DCB" w:themeColor="accent5" w:themeTint="99"/>
+          <w:sz w:val="32"/>
+          <w:szCs w:val="32"/>
+        </w:rPr>
+      </w:pPr>
+      <w:r>
+        <w:rPr>
+          <w:b/>
+          <w:bCs/>
+          <w:color w:val="D86DCB" w:themeColor="accent5" w:themeTint="99"/>
+          <w:sz w:val="32"/>
+          <w:szCs w:val="32"/>
+        </w:rPr>
+        <w:lastRenderedPageBreak/>
+        <w:t>}</w:t>
+      </w:r>
+    </w:p>
+    <w:p>
+      <w:pPr>
+        <w:jc w:val="both"/>
+        <w:rPr>
+          <w:sz w:val="32"/>
+          <w:szCs w:val="32"/>
+        </w:rPr>
+      </w:pPr>
+    </w:p>
+    <w:p>
+      <w:pPr>
+        <w:jc w:val="center"/>
+        <w:rPr>
+          <w:sz w:val="32"/>
+          <w:szCs w:val="32"/>
+        </w:rPr>
+      </w:pPr>
+      <w:r>
+        <w:rPr>
+          <w:sz w:val="32"/>
+          <w:szCs w:val="32"/>
+        </w:rPr>
+        <w:t>Break</w:t>
+      </w:r>
+    </w:p>
+    <w:p>
+      <w:pPr>
+        <w:jc w:val="both"/>
+        <w:rPr>
+          <w:sz w:val="32"/>
+          <w:szCs w:val="32"/>
+        </w:rPr>
+      </w:pPr>
+    </w:p>
+    <w:p>
+      <w:pPr>
+        <w:jc w:val="both"/>
+        <w:rPr>
+          <w:sz w:val="32"/>
+          <w:szCs w:val="32"/>
+        </w:rPr>
+      </w:pPr>
+    </w:p>
     <w:sectPr>
       <w:footerReference w:type="default" r:id="rId7"/>
       <w:pgSz w:w="11906" w:h="16838" w:code="9"/>
@@ -25172,6 +26990,119 @@
     </w:lvl>
   </w:abstractNum>
   <w:abstractNum w:abstractNumId="18" w15:restartNumberingAfterBreak="0">
+    <w:nsid w:val="408147D1"/>
+    <w:multiLevelType w:val="hybridMultilevel"/>
+    <w:tmpl w:val="BBE0063A"/>
+    <w:lvl w:ilvl="0" w:tplc="04090001">
+      <w:start w:val="1"/>
+      <w:numFmt w:val="bullet"/>
+      <w:lvlText w:val=""/>
+      <w:lvlJc w:val="left"/>
+      <w:pPr>
+        <w:ind w:left="360" w:hanging="360"/>
+      </w:pPr>
+      <w:rPr>
+        <w:rFonts w:ascii="Symbol" w:hAnsi="Symbol" w:hint="default"/>
+      </w:rPr>
+    </w:lvl>
+    <w:lvl w:ilvl="1" w:tplc="04090003" w:tentative="1">
+      <w:start w:val="1"/>
+      <w:numFmt w:val="bullet"/>
+      <w:lvlText w:val="o"/>
+      <w:lvlJc w:val="left"/>
+      <w:pPr>
+        <w:ind w:left="1080" w:hanging="360"/>
+      </w:pPr>
+      <w:rPr>
+        <w:rFonts w:ascii="Courier New" w:hAnsi="Courier New" w:cs="Courier New" w:hint="default"/>
+      </w:rPr>
+    </w:lvl>
+    <w:lvl w:ilvl="2" w:tplc="04090005" w:tentative="1">
+      <w:start w:val="1"/>
+      <w:numFmt w:val="bullet"/>
+      <w:lvlText w:val=""/>
+      <w:lvlJc w:val="left"/>
+      <w:pPr>
+        <w:ind w:left="1800" w:hanging="360"/>
+      </w:pPr>
+      <w:rPr>
+        <w:rFonts w:ascii="Wingdings" w:hAnsi="Wingdings" w:hint="default"/>
+      </w:rPr>
+    </w:lvl>
+    <w:lvl w:ilvl="3" w:tplc="04090001" w:tentative="1">
+      <w:start w:val="1"/>
+      <w:numFmt w:val="bullet"/>
+      <w:lvlText w:val=""/>
+      <w:lvlJc w:val="left"/>
+      <w:pPr>
+        <w:ind w:left="2520" w:hanging="360"/>
+      </w:pPr>
+      <w:rPr>
+        <w:rFonts w:ascii="Symbol" w:hAnsi="Symbol" w:hint="default"/>
+      </w:rPr>
+    </w:lvl>
+    <w:lvl w:ilvl="4" w:tplc="04090003" w:tentative="1">
+      <w:start w:val="1"/>
+      <w:numFmt w:val="bullet"/>
+      <w:lvlText w:val="o"/>
+      <w:lvlJc w:val="left"/>
+      <w:pPr>
+        <w:ind w:left="3240" w:hanging="360"/>
+      </w:pPr>
+      <w:rPr>
+        <w:rFonts w:ascii="Courier New" w:hAnsi="Courier New" w:cs="Courier New" w:hint="default"/>
+      </w:rPr>
+    </w:lvl>
+    <w:lvl w:ilvl="5" w:tplc="04090005" w:tentative="1">
+      <w:start w:val="1"/>
+      <w:numFmt w:val="bullet"/>
+      <w:lvlText w:val=""/>
+      <w:lvlJc w:val="left"/>
+      <w:pPr>
+        <w:ind w:left="3960" w:hanging="360"/>
+      </w:pPr>
+      <w:rPr>
+        <w:rFonts w:ascii="Wingdings" w:hAnsi="Wingdings" w:hint="default"/>
+      </w:rPr>
+    </w:lvl>
+    <w:lvl w:ilvl="6" w:tplc="04090001" w:tentative="1">
+      <w:start w:val="1"/>
+      <w:numFmt w:val="bullet"/>
+      <w:lvlText w:val=""/>
+      <w:lvlJc w:val="left"/>
+      <w:pPr>
+        <w:ind w:left="4680" w:hanging="360"/>
+      </w:pPr>
+      <w:rPr>
+        <w:rFonts w:ascii="Symbol" w:hAnsi="Symbol" w:hint="default"/>
+      </w:rPr>
+    </w:lvl>
+    <w:lvl w:ilvl="7" w:tplc="04090003" w:tentative="1">
+      <w:start w:val="1"/>
+      <w:numFmt w:val="bullet"/>
+      <w:lvlText w:val="o"/>
+      <w:lvlJc w:val="left"/>
+      <w:pPr>
+        <w:ind w:left="5400" w:hanging="360"/>
+      </w:pPr>
+      <w:rPr>
+        <w:rFonts w:ascii="Courier New" w:hAnsi="Courier New" w:cs="Courier New" w:hint="default"/>
+      </w:rPr>
+    </w:lvl>
+    <w:lvl w:ilvl="8" w:tplc="04090005" w:tentative="1">
+      <w:start w:val="1"/>
+      <w:numFmt w:val="bullet"/>
+      <w:lvlText w:val=""/>
+      <w:lvlJc w:val="left"/>
+      <w:pPr>
+        <w:ind w:left="6120" w:hanging="360"/>
+      </w:pPr>
+      <w:rPr>
+        <w:rFonts w:ascii="Wingdings" w:hAnsi="Wingdings" w:hint="default"/>
+      </w:rPr>
+    </w:lvl>
+  </w:abstractNum>
+  <w:abstractNum w:abstractNumId="19" w15:restartNumberingAfterBreak="0">
     <w:nsid w:val="40DA2AD8"/>
     <w:multiLevelType w:val="hybridMultilevel"/>
     <w:tmpl w:val="B49E92B8"/>
@@ -25284,7 +27215,7 @@
       </w:rPr>
     </w:lvl>
   </w:abstractNum>
-  <w:abstractNum w:abstractNumId="19" w15:restartNumberingAfterBreak="0">
+  <w:abstractNum w:abstractNumId="20" w15:restartNumberingAfterBreak="0">
     <w:nsid w:val="41674649"/>
     <w:multiLevelType w:val="hybridMultilevel"/>
     <w:tmpl w:val="681A0D48"/>
@@ -25375,7 +27306,7 @@
       </w:pPr>
     </w:lvl>
   </w:abstractNum>
-  <w:abstractNum w:abstractNumId="20" w15:restartNumberingAfterBreak="0">
+  <w:abstractNum w:abstractNumId="21" w15:restartNumberingAfterBreak="0">
     <w:nsid w:val="42236825"/>
     <w:multiLevelType w:val="hybridMultilevel"/>
     <w:tmpl w:val="30326558"/>
@@ -25488,7 +27419,7 @@
       </w:rPr>
     </w:lvl>
   </w:abstractNum>
-  <w:abstractNum w:abstractNumId="21" w15:restartNumberingAfterBreak="0">
+  <w:abstractNum w:abstractNumId="22" w15:restartNumberingAfterBreak="0">
     <w:nsid w:val="42585CD1"/>
     <w:multiLevelType w:val="hybridMultilevel"/>
     <w:tmpl w:val="0A362868"/>
@@ -25601,7 +27532,7 @@
       </w:rPr>
     </w:lvl>
   </w:abstractNum>
-  <w:abstractNum w:abstractNumId="22" w15:restartNumberingAfterBreak="0">
+  <w:abstractNum w:abstractNumId="23" w15:restartNumberingAfterBreak="0">
     <w:nsid w:val="43043B8C"/>
     <w:multiLevelType w:val="hybridMultilevel"/>
     <w:tmpl w:val="6C602B9E"/>
@@ -25714,7 +27645,7 @@
       </w:rPr>
     </w:lvl>
   </w:abstractNum>
-  <w:abstractNum w:abstractNumId="23" w15:restartNumberingAfterBreak="0">
+  <w:abstractNum w:abstractNumId="24" w15:restartNumberingAfterBreak="0">
     <w:nsid w:val="458B1C4B"/>
     <w:multiLevelType w:val="hybridMultilevel"/>
     <w:tmpl w:val="40DEF892"/>
@@ -25803,7 +27734,7 @@
       </w:pPr>
     </w:lvl>
   </w:abstractNum>
-  <w:abstractNum w:abstractNumId="24" w15:restartNumberingAfterBreak="0">
+  <w:abstractNum w:abstractNumId="25" w15:restartNumberingAfterBreak="0">
     <w:nsid w:val="49CA060A"/>
     <w:multiLevelType w:val="hybridMultilevel"/>
     <w:tmpl w:val="B3AA0062"/>
@@ -25916,7 +27847,7 @@
       </w:rPr>
     </w:lvl>
   </w:abstractNum>
-  <w:abstractNum w:abstractNumId="25" w15:restartNumberingAfterBreak="0">
+  <w:abstractNum w:abstractNumId="26" w15:restartNumberingAfterBreak="0">
     <w:nsid w:val="4B943F8A"/>
     <w:multiLevelType w:val="hybridMultilevel"/>
     <w:tmpl w:val="54DA842A"/>
@@ -26007,7 +27938,7 @@
       </w:pPr>
     </w:lvl>
   </w:abstractNum>
-  <w:abstractNum w:abstractNumId="26" w15:restartNumberingAfterBreak="0">
+  <w:abstractNum w:abstractNumId="27" w15:restartNumberingAfterBreak="0">
     <w:nsid w:val="4BCD3BC2"/>
     <w:multiLevelType w:val="hybridMultilevel"/>
     <w:tmpl w:val="672EECE2"/>
@@ -26120,7 +28051,7 @@
       </w:rPr>
     </w:lvl>
   </w:abstractNum>
-  <w:abstractNum w:abstractNumId="27" w15:restartNumberingAfterBreak="0">
+  <w:abstractNum w:abstractNumId="28" w15:restartNumberingAfterBreak="0">
     <w:nsid w:val="4DB604E0"/>
     <w:multiLevelType w:val="hybridMultilevel"/>
     <w:tmpl w:val="571417CA"/>
@@ -26233,7 +28164,7 @@
       </w:rPr>
     </w:lvl>
   </w:abstractNum>
-  <w:abstractNum w:abstractNumId="28" w15:restartNumberingAfterBreak="0">
+  <w:abstractNum w:abstractNumId="29" w15:restartNumberingAfterBreak="0">
     <w:nsid w:val="50593AB5"/>
     <w:multiLevelType w:val="hybridMultilevel"/>
     <w:tmpl w:val="EAD6CAAA"/>
@@ -26346,7 +28277,7 @@
       </w:rPr>
     </w:lvl>
   </w:abstractNum>
-  <w:abstractNum w:abstractNumId="29" w15:restartNumberingAfterBreak="0">
+  <w:abstractNum w:abstractNumId="30" w15:restartNumberingAfterBreak="0">
     <w:nsid w:val="52305214"/>
     <w:multiLevelType w:val="hybridMultilevel"/>
     <w:tmpl w:val="135AC008"/>
@@ -26459,7 +28390,7 @@
       </w:rPr>
     </w:lvl>
   </w:abstractNum>
-  <w:abstractNum w:abstractNumId="30" w15:restartNumberingAfterBreak="0">
+  <w:abstractNum w:abstractNumId="31" w15:restartNumberingAfterBreak="0">
     <w:nsid w:val="55864505"/>
     <w:multiLevelType w:val="hybridMultilevel"/>
     <w:tmpl w:val="1E24B93A"/>
@@ -26572,7 +28503,7 @@
       </w:rPr>
     </w:lvl>
   </w:abstractNum>
-  <w:abstractNum w:abstractNumId="31" w15:restartNumberingAfterBreak="0">
+  <w:abstractNum w:abstractNumId="32" w15:restartNumberingAfterBreak="0">
     <w:nsid w:val="570F2063"/>
     <w:multiLevelType w:val="hybridMultilevel"/>
     <w:tmpl w:val="68E81DBE"/>
@@ -26685,7 +28616,7 @@
       </w:rPr>
     </w:lvl>
   </w:abstractNum>
-  <w:abstractNum w:abstractNumId="32" w15:restartNumberingAfterBreak="0">
+  <w:abstractNum w:abstractNumId="33" w15:restartNumberingAfterBreak="0">
     <w:nsid w:val="5759398E"/>
     <w:multiLevelType w:val="hybridMultilevel"/>
     <w:tmpl w:val="57C4504C"/>
@@ -26798,7 +28729,7 @@
       </w:rPr>
     </w:lvl>
   </w:abstractNum>
-  <w:abstractNum w:abstractNumId="33" w15:restartNumberingAfterBreak="0">
+  <w:abstractNum w:abstractNumId="34" w15:restartNumberingAfterBreak="0">
     <w:nsid w:val="58DA6B58"/>
     <w:multiLevelType w:val="hybridMultilevel"/>
     <w:tmpl w:val="CAB41418"/>
@@ -26911,7 +28842,7 @@
       </w:rPr>
     </w:lvl>
   </w:abstractNum>
-  <w:abstractNum w:abstractNumId="34" w15:restartNumberingAfterBreak="0">
+  <w:abstractNum w:abstractNumId="35" w15:restartNumberingAfterBreak="0">
     <w:nsid w:val="59747A7E"/>
     <w:multiLevelType w:val="hybridMultilevel"/>
     <w:tmpl w:val="32AA169E"/>
@@ -27024,7 +28955,7 @@
       </w:rPr>
     </w:lvl>
   </w:abstractNum>
-  <w:abstractNum w:abstractNumId="35" w15:restartNumberingAfterBreak="0">
+  <w:abstractNum w:abstractNumId="36" w15:restartNumberingAfterBreak="0">
     <w:nsid w:val="59C062D7"/>
     <w:multiLevelType w:val="hybridMultilevel"/>
     <w:tmpl w:val="1CAEC378"/>
@@ -27137,7 +29068,7 @@
       </w:rPr>
     </w:lvl>
   </w:abstractNum>
-  <w:abstractNum w:abstractNumId="36" w15:restartNumberingAfterBreak="0">
+  <w:abstractNum w:abstractNumId="37" w15:restartNumberingAfterBreak="0">
     <w:nsid w:val="5B4A672C"/>
     <w:multiLevelType w:val="hybridMultilevel"/>
     <w:tmpl w:val="B0F2D0D8"/>
@@ -27250,7 +29181,7 @@
       </w:rPr>
     </w:lvl>
   </w:abstractNum>
-  <w:abstractNum w:abstractNumId="37" w15:restartNumberingAfterBreak="0">
+  <w:abstractNum w:abstractNumId="38" w15:restartNumberingAfterBreak="0">
     <w:nsid w:val="6544381C"/>
     <w:multiLevelType w:val="hybridMultilevel"/>
     <w:tmpl w:val="857698A6"/>
@@ -27363,7 +29294,7 @@
       </w:rPr>
     </w:lvl>
   </w:abstractNum>
-  <w:abstractNum w:abstractNumId="38" w15:restartNumberingAfterBreak="0">
+  <w:abstractNum w:abstractNumId="39" w15:restartNumberingAfterBreak="0">
     <w:nsid w:val="6AA91FCE"/>
     <w:multiLevelType w:val="hybridMultilevel"/>
     <w:tmpl w:val="B0100C5C"/>
@@ -27476,7 +29407,7 @@
       </w:rPr>
     </w:lvl>
   </w:abstractNum>
-  <w:abstractNum w:abstractNumId="39" w15:restartNumberingAfterBreak="0">
+  <w:abstractNum w:abstractNumId="40" w15:restartNumberingAfterBreak="0">
     <w:nsid w:val="703629B5"/>
     <w:multiLevelType w:val="hybridMultilevel"/>
     <w:tmpl w:val="62502D8A"/>
@@ -27589,7 +29520,7 @@
       </w:rPr>
     </w:lvl>
   </w:abstractNum>
-  <w:abstractNum w:abstractNumId="40" w15:restartNumberingAfterBreak="0">
+  <w:abstractNum w:abstractNumId="41" w15:restartNumberingAfterBreak="0">
     <w:nsid w:val="719B1037"/>
     <w:multiLevelType w:val="hybridMultilevel"/>
     <w:tmpl w:val="94667F8A"/>
@@ -27702,7 +29633,7 @@
       </w:rPr>
     </w:lvl>
   </w:abstractNum>
-  <w:abstractNum w:abstractNumId="41" w15:restartNumberingAfterBreak="0">
+  <w:abstractNum w:abstractNumId="42" w15:restartNumberingAfterBreak="0">
     <w:nsid w:val="737B0D5E"/>
     <w:multiLevelType w:val="hybridMultilevel"/>
     <w:tmpl w:val="8BE2F570"/>
@@ -27793,7 +29724,7 @@
       </w:pPr>
     </w:lvl>
   </w:abstractNum>
-  <w:abstractNum w:abstractNumId="42" w15:restartNumberingAfterBreak="0">
+  <w:abstractNum w:abstractNumId="43" w15:restartNumberingAfterBreak="0">
     <w:nsid w:val="76B41E50"/>
     <w:multiLevelType w:val="hybridMultilevel"/>
     <w:tmpl w:val="2F9CC114"/>
@@ -27906,7 +29837,7 @@
       </w:rPr>
     </w:lvl>
   </w:abstractNum>
-  <w:abstractNum w:abstractNumId="43" w15:restartNumberingAfterBreak="0">
+  <w:abstractNum w:abstractNumId="44" w15:restartNumberingAfterBreak="0">
     <w:nsid w:val="77BB17C9"/>
     <w:multiLevelType w:val="hybridMultilevel"/>
     <w:tmpl w:val="48C4F014"/>
@@ -28019,7 +29950,7 @@
       </w:rPr>
     </w:lvl>
   </w:abstractNum>
-  <w:abstractNum w:abstractNumId="44" w15:restartNumberingAfterBreak="0">
+  <w:abstractNum w:abstractNumId="45" w15:restartNumberingAfterBreak="0">
     <w:nsid w:val="7B2637DF"/>
     <w:multiLevelType w:val="hybridMultilevel"/>
     <w:tmpl w:val="69AA28A0"/>
@@ -28132,7 +30063,7 @@
       </w:rPr>
     </w:lvl>
   </w:abstractNum>
-  <w:abstractNum w:abstractNumId="45" w15:restartNumberingAfterBreak="0">
+  <w:abstractNum w:abstractNumId="46" w15:restartNumberingAfterBreak="0">
     <w:nsid w:val="7E030B59"/>
     <w:multiLevelType w:val="hybridMultilevel"/>
     <w:tmpl w:val="0DDADC0A"/>
@@ -28245,7 +30176,7 @@
       </w:rPr>
     </w:lvl>
   </w:abstractNum>
-  <w:abstractNum w:abstractNumId="46" w15:restartNumberingAfterBreak="0">
+  <w:abstractNum w:abstractNumId="47" w15:restartNumberingAfterBreak="0">
     <w:nsid w:val="7F105230"/>
     <w:multiLevelType w:val="hybridMultilevel"/>
     <w:tmpl w:val="730ABCA8"/>
@@ -28365,16 +30296,16 @@
     <w:abstractNumId w:val="0"/>
   </w:num>
   <w:num w:numId="3" w16cid:durableId="560404118">
-    <w:abstractNumId w:val="23"/>
+    <w:abstractNumId w:val="24"/>
   </w:num>
   <w:num w:numId="4" w16cid:durableId="1500000276">
     <w:abstractNumId w:val="17"/>
   </w:num>
   <w:num w:numId="5" w16cid:durableId="1737321144">
-    <w:abstractNumId w:val="32"/>
+    <w:abstractNumId w:val="33"/>
   </w:num>
   <w:num w:numId="6" w16cid:durableId="1837187161">
-    <w:abstractNumId w:val="26"/>
+    <w:abstractNumId w:val="27"/>
   </w:num>
   <w:num w:numId="7" w16cid:durableId="1024091516">
     <w:abstractNumId w:val="5"/>
@@ -28383,31 +30314,31 @@
     <w:abstractNumId w:val="15"/>
   </w:num>
   <w:num w:numId="9" w16cid:durableId="1903711065">
-    <w:abstractNumId w:val="21"/>
+    <w:abstractNumId w:val="22"/>
   </w:num>
   <w:num w:numId="10" w16cid:durableId="1006708407">
-    <w:abstractNumId w:val="19"/>
+    <w:abstractNumId w:val="20"/>
   </w:num>
   <w:num w:numId="11" w16cid:durableId="1216888095">
     <w:abstractNumId w:val="2"/>
   </w:num>
   <w:num w:numId="12" w16cid:durableId="667833985">
-    <w:abstractNumId w:val="30"/>
+    <w:abstractNumId w:val="31"/>
   </w:num>
   <w:num w:numId="13" w16cid:durableId="168568228">
-    <w:abstractNumId w:val="22"/>
+    <w:abstractNumId w:val="23"/>
   </w:num>
   <w:num w:numId="14" w16cid:durableId="1988629226">
-    <w:abstractNumId w:val="27"/>
+    <w:abstractNumId w:val="28"/>
   </w:num>
   <w:num w:numId="15" w16cid:durableId="1397702807">
-    <w:abstractNumId w:val="41"/>
+    <w:abstractNumId w:val="42"/>
   </w:num>
   <w:num w:numId="16" w16cid:durableId="1470173009">
-    <w:abstractNumId w:val="18"/>
+    <w:abstractNumId w:val="19"/>
   </w:num>
   <w:num w:numId="17" w16cid:durableId="2089955940">
-    <w:abstractNumId w:val="29"/>
+    <w:abstractNumId w:val="30"/>
   </w:num>
   <w:num w:numId="18" w16cid:durableId="2110393214">
     <w:abstractNumId w:val="7"/>
@@ -28419,31 +30350,31 @@
     <w:abstractNumId w:val="4"/>
   </w:num>
   <w:num w:numId="21" w16cid:durableId="1155683406">
-    <w:abstractNumId w:val="38"/>
+    <w:abstractNumId w:val="39"/>
   </w:num>
   <w:num w:numId="22" w16cid:durableId="179469594">
     <w:abstractNumId w:val="10"/>
   </w:num>
   <w:num w:numId="23" w16cid:durableId="1029913492">
-    <w:abstractNumId w:val="35"/>
+    <w:abstractNumId w:val="36"/>
   </w:num>
   <w:num w:numId="24" w16cid:durableId="2042045210">
-    <w:abstractNumId w:val="20"/>
+    <w:abstractNumId w:val="21"/>
   </w:num>
   <w:num w:numId="25" w16cid:durableId="1795324142">
     <w:abstractNumId w:val="9"/>
   </w:num>
   <w:num w:numId="26" w16cid:durableId="307320946">
-    <w:abstractNumId w:val="28"/>
+    <w:abstractNumId w:val="29"/>
   </w:num>
   <w:num w:numId="27" w16cid:durableId="2044136394">
     <w:abstractNumId w:val="1"/>
   </w:num>
   <w:num w:numId="28" w16cid:durableId="907229179">
-    <w:abstractNumId w:val="37"/>
+    <w:abstractNumId w:val="38"/>
   </w:num>
   <w:num w:numId="29" w16cid:durableId="33387513">
-    <w:abstractNumId w:val="43"/>
+    <w:abstractNumId w:val="44"/>
   </w:num>
   <w:num w:numId="30" w16cid:durableId="33624391">
     <w:abstractNumId w:val="3"/>
@@ -28455,37 +30386,37 @@
     <w:abstractNumId w:val="13"/>
   </w:num>
   <w:num w:numId="33" w16cid:durableId="671487690">
+    <w:abstractNumId w:val="41"/>
+  </w:num>
+  <w:num w:numId="34" w16cid:durableId="1651473981">
+    <w:abstractNumId w:val="25"/>
+  </w:num>
+  <w:num w:numId="35" w16cid:durableId="1648626007">
+    <w:abstractNumId w:val="26"/>
+  </w:num>
+  <w:num w:numId="36" w16cid:durableId="468859209">
+    <w:abstractNumId w:val="34"/>
+  </w:num>
+  <w:num w:numId="37" w16cid:durableId="1020820454">
+    <w:abstractNumId w:val="46"/>
+  </w:num>
+  <w:num w:numId="38" w16cid:durableId="2066562424">
+    <w:abstractNumId w:val="37"/>
+  </w:num>
+  <w:num w:numId="39" w16cid:durableId="847594252">
     <w:abstractNumId w:val="40"/>
   </w:num>
-  <w:num w:numId="34" w16cid:durableId="1651473981">
-    <w:abstractNumId w:val="24"/>
-  </w:num>
-  <w:num w:numId="35" w16cid:durableId="1648626007">
-    <w:abstractNumId w:val="25"/>
-  </w:num>
-  <w:num w:numId="36" w16cid:durableId="468859209">
-    <w:abstractNumId w:val="33"/>
-  </w:num>
-  <w:num w:numId="37" w16cid:durableId="1020820454">
-    <w:abstractNumId w:val="45"/>
-  </w:num>
-  <w:num w:numId="38" w16cid:durableId="2066562424">
-    <w:abstractNumId w:val="36"/>
-  </w:num>
-  <w:num w:numId="39" w16cid:durableId="847594252">
-    <w:abstractNumId w:val="39"/>
-  </w:num>
   <w:num w:numId="40" w16cid:durableId="627783562">
-    <w:abstractNumId w:val="31"/>
+    <w:abstractNumId w:val="32"/>
   </w:num>
   <w:num w:numId="41" w16cid:durableId="501317107">
     <w:abstractNumId w:val="11"/>
   </w:num>
   <w:num w:numId="42" w16cid:durableId="1557231359">
-    <w:abstractNumId w:val="42"/>
+    <w:abstractNumId w:val="43"/>
   </w:num>
   <w:num w:numId="43" w16cid:durableId="1437671524">
-    <w:abstractNumId w:val="34"/>
+    <w:abstractNumId w:val="35"/>
   </w:num>
   <w:num w:numId="44" w16cid:durableId="497615622">
     <w:abstractNumId w:val="12"/>
@@ -28494,10 +30425,13 @@
     <w:abstractNumId w:val="14"/>
   </w:num>
   <w:num w:numId="46" w16cid:durableId="1031028739">
-    <w:abstractNumId w:val="46"/>
+    <w:abstractNumId w:val="47"/>
   </w:num>
   <w:num w:numId="47" w16cid:durableId="616251882">
-    <w:abstractNumId w:val="44"/>
+    <w:abstractNumId w:val="45"/>
+  </w:num>
+  <w:num w:numId="48" w16cid:durableId="363601376">
+    <w:abstractNumId w:val="18"/>
   </w:num>
   <w:numIdMacAtCleanup w:val="37"/>
 </w:numbering>
@@ -29105,6 +31039,7 @@
   <w:style w:type="character" w:default="1" w:styleId="DefaultParagraphFont">
     <w:name w:val="Default Paragraph Font"/>
     <w:uiPriority w:val="1"/>
+    <w:semiHidden/>
     <w:unhideWhenUsed/>
   </w:style>
   <w:style w:type="table" w:default="1" w:styleId="TableNormal">

</xml_diff>